<commit_message>
Bring export up to parity with Folio, and add Insert frontmatter
- Typst as a second PDF engine, using Folio's MLA, Turabian and default
  templates and bundled fonts; LibreOffice remains for custom reference
  docs, and installs from before this version stay on it
- Separate PDF and DOCX export commands
- subtitle: support, per-style date formatting, turabian alias
- Resolve bibliography: and csl: against the vault, default the CSL from
  style:, pass citeproc only the cited entries, and stop when the .bib
  is missing
- Hanging indent for hand-typed bibliographies, content-fitted table
  columns, Folio's newer reference docs
- Strip frontmatter before pandoc so unquoted colons in titles no longer
  fail the docx path
- Private LibreOffice profile, step progress, error log in .md2pdf/,
  and an offer to open or reveal the export
- Insert export frontmatter command

Co-Authored-By: Claude Opus 5.5 <noreply@anthropic.com>
</commit_message>
<xml_diff>
--- a/dg.double.docx
+++ b/dg.double.docx
@@ -780,7 +780,7 @@
 <w:hdr xmlns:o="urn:schemas-microsoft-com:office:office" xmlns:r="http://schemas.openxmlformats.org/officeDocument/2006/relationships" xmlns:v="urn:schemas-microsoft-com:vml" xmlns:w="http://schemas.openxmlformats.org/wordprocessingml/2006/main" xmlns:w10="urn:schemas-microsoft-com:office:word" xmlns:wp="http://schemas.openxmlformats.org/drawingml/2006/wordprocessingDrawing" xmlns:pic="http://schemas.openxmlformats.org/drawingml/2006/picture" xmlns:wps="http://schemas.microsoft.com/office/word/2010/wordprocessingShape" xmlns:wpg="http://schemas.microsoft.com/office/word/2010/wordprocessingGroup" xmlns:mc="http://schemas.openxmlformats.org/markup-compatibility/2006" xmlns:wp14="http://schemas.microsoft.com/office/word/2010/wordprocessingDrawing" xmlns:w14="http://schemas.microsoft.com/office/word/2010/wordml" xmlns:w15="http://schemas.microsoft.com/office/word/2012/wordml" mc:Ignorable="w14 wp14 w15">
   <w:p>
     <w:pPr>
-      <w:pStyle w:val="HeaderLeft"/>
+      <w:pStyle w:val="HeaderLeftuser"/>
       <w:suppressLineNumbers/>
       <w:spacing w:before="0" w:after="200"/>
       <w:rPr/>
@@ -1212,15 +1212,15 @@
     <w:qFormat/>
     <w:rPr/>
   </w:style>
+  <w:style w:type="character" w:styleId="FootnoteCharactersuser">
+    <w:name w:val="Footnote Characters (user)"/>
+    <w:qFormat/>
+    <w:rPr>
+      <w:vertAlign w:val="superscript"/>
+    </w:rPr>
+  </w:style>
   <w:style w:type="character" w:styleId="FootnoteCharacters">
     <w:name w:val="Footnote Characters"/>
-    <w:qFormat/>
-    <w:rPr>
-      <w:vertAlign w:val="superscript"/>
-    </w:rPr>
-  </w:style>
-  <w:style w:type="character" w:styleId="FootnoteCharactersuser">
-    <w:name w:val="Footnote Characters (user)"/>
     <w:qFormat/>
     <w:rPr>
       <w:vertAlign w:val="superscript"/>
@@ -1239,15 +1239,15 @@
       <w:color w:themeColor="accent1" w:val="4F81BD"/>
     </w:rPr>
   </w:style>
+  <w:style w:type="character" w:styleId="EndnoteCharacters">
+    <w:name w:val="Endnote Characters"/>
+    <w:qFormat/>
+    <w:rPr>
+      <w:vertAlign w:val="superscript"/>
+    </w:rPr>
+  </w:style>
   <w:style w:type="character" w:styleId="EndnoteCharactersuser">
     <w:name w:val="Endnote Characters (user)"/>
-    <w:qFormat/>
-    <w:rPr>
-      <w:vertAlign w:val="superscript"/>
-    </w:rPr>
-  </w:style>
-  <w:style w:type="character" w:styleId="EndnoteCharacters">
-    <w:name w:val="Endnote Characters"/>
     <w:qFormat/>
     <w:rPr>
       <w:vertAlign w:val="superscript"/>
@@ -1323,7 +1323,7 @@
     <w:qFormat/>
     <w:pPr>
       <w:spacing w:lineRule="auto" w:line="480"/>
-      <w:ind w:hanging="0" w:left="0"/>
+      <w:ind w:firstLine="720" w:left="0"/>
     </w:pPr>
     <w:rPr/>
   </w:style>
@@ -1592,8 +1592,8 @@
     </w:pPr>
     <w:rPr/>
   </w:style>
-  <w:style w:type="paragraph" w:styleId="HeaderLeft">
-    <w:name w:val="Header Left"/>
+  <w:style w:type="paragraph" w:styleId="HeaderLeftuser">
+    <w:name w:val="Header Left (user)"/>
     <w:basedOn w:val="Header"/>
     <w:qFormat/>
     <w:pPr>
@@ -1608,10 +1608,18 @@
     <w:unhideWhenUsed/>
     <w:qFormat/>
     <w:tblPr>
+      <w:tblBorders>
+        <w:top w:val="single" w:sz="4" w:space="0" w:color="000000"/>
+        <w:left w:val="single" w:sz="4" w:space="0" w:color="000000"/>
+        <w:bottom w:val="single" w:sz="4" w:space="0" w:color="000000"/>
+        <w:right w:val="single" w:sz="4" w:space="0" w:color="000000"/>
+        <w:insideH w:val="single" w:sz="4" w:space="0" w:color="000000"/>
+        <w:insideV w:val="single" w:sz="4" w:space="0" w:color="000000"/>
+      </w:tblBorders>
       <w:tblCellMar>
-        <w:top w:w="0" w:type="dxa"/>
+        <w:top w:w="72" w:type="dxa"/>
         <w:left w:w="108" w:type="dxa"/>
-        <w:bottom w:w="0" w:type="dxa"/>
+        <w:bottom w:w="72" w:type="dxa"/>
         <w:right w:w="108" w:type="dxa"/>
       </w:tblCellMar>
     </w:tblPr>
@@ -1619,7 +1627,7 @@
       <w:tblPr/>
       <w:tcPr>
         <w:tcBorders>
-          <w:bottom w:val="single"/>
+          <w:bottom w:val="single" w:sz="12" w:space="0" w:color="000000"/>
         </w:tcBorders>
         <w:vAlign w:val="bottom"/>
       </w:tcPr>

</xml_diff>